<commit_message>
diagrams: one box per element, which is the shape that was being asked for
The -uml diagram gave a box only to elements that have children and folded
every leaf into its parent as +name : Type [0..1]. BeModelAllergyIntolerance
came out as three boxes. What is wanted is the model as one box and every
element below it as a box of its own, joined by a line carrying the
cardinality - seventeen boxes for that model, each field visible as a thing in
its own right.

The datatype moves to a stereotype in the box header rather than an attribute
line, since the box is now the element; a value set binding shows inside it. A
nested element hangs off its own parent, so status.clinicalStatus sits under
status rather than beside it, and an element whose parent is not itself in the
model is attached to the model rather than dropped from the diagram.

--uml-style attributes keeps the previous drawing for anyone who wants the
compact one.

Co-Authored-By: Claude Opus 5 <noreply@anthropic.com>
</commit_message>
<xml_diff>
--- a/exports/diagrams/BeModelAllergyIntolerance.docx
+++ b/exports/diagrams/BeModelAllergyIntolerance.docx
@@ -214,7 +214,7 @@
       <w:r>
         <w:drawing>
           <wp:inline xmlns:a="http://schemas.openxmlformats.org/drawingml/2006/main" xmlns:pic="http://schemas.openxmlformats.org/drawingml/2006/picture">
-            <wp:extent cx="5760720" cy="3436040"/>
+            <wp:extent cx="5760720" cy="1299598"/>
             <wp:docPr id="1" name="Picture 1"/>
             <wp:cNvGraphicFramePr>
               <a:graphicFrameLocks noChangeAspect="1"/>
@@ -235,7 +235,7 @@
                   <pic:spPr>
                     <a:xfrm>
                       <a:off x="0" y="0"/>
-                      <a:ext cx="5760720" cy="3436040"/>
+                      <a:ext cx="5760720" cy="1299598"/>
                     </a:xfrm>
                     <a:prstGeom prst="rect"/>
                   </pic:spPr>

</xml_diff>